<commit_message>
fix: third-round audit — F10 conversation ownership enforcement
- F10 (horizontal privilege escalation): GET/DELETE
  /api/conversations/{cid} previously served any caller who knew the
  12-hex conversation id. Now the API verifies the conversation owner
  against X-User-Token; not-owner and not-found both return 404 (no
  existence leak). Frontend history replay now sends the user token.
- Hygiene: ingestion._load_seed made public as load_seed (API layer no
  longer touches a private function).
- Tests: +1 (test_conversation_isolation) -> 14/14 pass.

Docs synced: IMPROVEMENTS (F10 section), traceability (F10 row),
README (security line + 2026-10-27 section); course deliverables
rebuilt (13 test cases incl. TC-013, report totals, summary counts);
SRS/SDD docs updated (security/counts) with PDF re-export; new
validation artifact artifacts/validation_2026-10-27.txt and
docs/交付物清单.md deliverables index.
</commit_message>
<xml_diff>
--- a/docs/智问校园CampusMind-SRS需求规格说明书.docx
+++ b/docs/智问校园CampusMind-SRS需求规格说明书.docx
@@ -526,7 +526,7 @@
             <w:spacing w:before="120" w:after="60"/>
           </w:pPr>
           <w:r>
-            <w:t>3.3  FR-3 会话与历史</w:t>
+            <w:t>3.3  FR-3 会话与历史(属主隔离)</w:t>
           </w:r>
           <w:r>
             <w:tab/>
@@ -2837,7 +2837,7 @@
           <w:sz w:val="28"/>
           <w:szCs w:val="28"/>
         </w:rPr>
-        <w:t xml:space="preserve">3.3  FR-3 会话与历史</w:t>
+        <w:t xml:space="preserve">3.3  FR-3 会话与历史(属主隔离)</w:t>
       </w:r>
       <w:bookmarkEnd w:id="15"/>
     </w:p>
@@ -2965,6 +2965,31 @@
           <w:szCs w:val="24"/>
         </w:rPr>
         <w:t xml:space="preserve">删除会话:级联删除消息记录</w:t>
+      </w:r>
+    </w:p>
+    <w:p>
+      <w:pPr>
+        <w:spacing w:after="40" w:line="312"/>
+        <w:ind w:left="420" w:hanging="240"/>
+        <w:jc w:val="both"/>
+      </w:pPr>
+      <w:r>
+        <w:rPr>
+          <w:rFonts w:ascii="Calibri" w:eastAsia="Microsoft YaHei"/>
+          <w:color w:val="3B5BFD"/>
+          <w:sz w:val="24"/>
+          <w:szCs w:val="24"/>
+        </w:rPr>
+        <w:t xml:space="preserve">▪  </w:t>
+      </w:r>
+      <w:r>
+        <w:rPr>
+          <w:rFonts w:ascii="Calibri" w:eastAsia="Microsoft YaHei"/>
+          <w:color w:val="243050"/>
+          <w:sz w:val="24"/>
+          <w:szCs w:val="24"/>
+        </w:rPr>
+        <w:t xml:space="preserve">越权访问他人会话:统一返回 404,不泄露存在性(F10)</w:t>
       </w:r>
     </w:p>
     <w:p>
@@ -4622,7 +4647,7 @@
                 <w:sz w:val="21"/>
                 <w:szCs w:val="21"/>
               </w:rPr>
-              <w:t xml:space="preserve">单用户限流 5 QPS/突发 10;写接口可鉴权;输出全量转义</w:t>
+              <w:t xml:space="preserve">单用户限流 5 QPS/突发 10;写接口可鉴权;输出全量转义;会话属主校验</w:t>
             </w:r>
           </w:p>
         </w:tc>
@@ -4651,7 +4676,7 @@
                 <w:sz w:val="21"/>
                 <w:szCs w:val="21"/>
               </w:rPr>
-              <w:t xml:space="preserve">验收 A2 PASS(200x10+429x5);XSS 三处转义修复;ADMIN_TOKEN 门禁</w:t>
+              <w:t xml:space="preserve">验收 A2 PASS(200x10+429x5);XSS 转义;ADMIN_TOKEN 门禁;F10 越权返回 404</w:t>
             </w:r>
           </w:p>
         </w:tc>
@@ -4893,7 +4918,7 @@
                 <w:sz w:val="21"/>
                 <w:szCs w:val="21"/>
               </w:rPr>
-              <w:t xml:space="preserve">pytest 13/13;评测/基准/验收四套脚本一条命令复现</w:t>
+              <w:t xml:space="preserve">pytest 14/14;评测/基准/验收四套脚本一条命令复现</w:t>
             </w:r>
           </w:p>
         </w:tc>
@@ -6067,7 +6092,7 @@
                 <w:sz w:val="21"/>
                 <w:szCs w:val="21"/>
               </w:rPr>
-              <w:t xml:space="preserve">会话消息 / 删除会话</w:t>
+              <w:t xml:space="preserve">会话消息 / 删除会话(属主校验)</w:t>
             </w:r>
           </w:p>
         </w:tc>
@@ -6096,7 +6121,7 @@
                 <w:sz w:val="21"/>
                 <w:szCs w:val="21"/>
               </w:rPr>
-              <w:t xml:space="preserve">404</w:t>
+              <w:t xml:space="preserve">404(含越权)</w:t>
             </w:r>
           </w:p>
         </w:tc>

</xml_diff>